<commit_message>
Ajusta informe de Maykel Astudillo con la defensa completa
Co-Authored-By: Claude Opus 5.5 <noreply@anthropic.com>
Claude-Session: https://claude.ai/code/session_01XoDZLsg3S6BNvJBdoo6Rq7
</commit_message>
<xml_diff>
--- a/informes/Informe_entrevista_Maykel_Astudillo.docx
+++ b/informes/Informe_entrevista_Maykel_Astudillo.docx
@@ -1519,7 +1519,7 @@
                 <w:sz w:val="22"/>
                 <w:szCs w:val="22"/>
               </w:rPr>
-              <w:t xml:space="preserve">PRÁCTICA 63/100 – NOTA FINAL PENDIENTE</w:t>
+              <w:t xml:space="preserve">PRÁCTICA 61/100 – NOTA FINAL PENDIENTE</w:t>
             </w:r>
           </w:p>
         </w:tc>
@@ -1885,7 +1885,7 @@
           <w:sz w:val="20"/>
           <w:szCs w:val="20"/>
         </w:rPr>
-        <w:t xml:space="preserve">La prueba práctica suma 63/100 (diseño 14/20, implementación 25/40, defensa 24/40). La solución mantiene las decisiones bancarias fuera del modelo: un flujo determinista con transiciones permitidas, un punto único de control de herramientas con permisos y esquemas estrictos, autenticación con JWT y un guard de PII antes y después del LLM. Las brechas principales son la resiliencia no implementada, una recuperación de políticas por coincidencia de palabras en lugar de búsqueda semántica, la ausencia de despliegue en la nube y que el candidato reconoció no haber revisado a detalle el código ni las pruebas generadas. La nota final queda pendiente de la evaluación teórica.</w:t>
+        <w:t xml:space="preserve">La prueba práctica suma 61/100 (diseño 14/20, implementación 25/40, defensa 22/40). La solución mantiene las decisiones bancarias fuera del modelo: un flujo determinista con transiciones permitidas, un punto único de control de herramientas con permisos y esquemas estrictos, autenticación con JWT y un guard de PII antes y después del LLM. Las brechas principales son la resiliencia no implementada, una recuperación de políticas por coincidencia de palabras en lugar de búsqueda semántica, la ausencia de despliegue en la nube y una defensa que explicó el código por debajo de lo que este implementa. La nota final queda pendiente de la evaluación teórica.</w:t>
       </w:r>
     </w:p>
     <w:p>
@@ -1917,7 +1917,7 @@
           <w:sz w:val="20"/>
           <w:szCs w:val="20"/>
         </w:rPr>
-        <w:t xml:space="preserve">Trabajó por fases (fase 1 y fase 2, con listas de verificación en docs/) y usó asistentes de IA para generar el código con instrucciones orientadas a la arquitectura. En la defensa sostuvo con convicción que los sub-agentes de este caso podrían ser un flujo determinista y que el LLM solo debe usarse donde aporta. Mencionó usar el motor de Copilot para los agentes.</w:t>
+        <w:t xml:space="preserve">Trabaja en un entorno bancario donde LangChain y LangGraph no están aprobados; ha construido motores agénticos deterministas sin framework (NestJS) y actualmente trabaja con Azure AI Foundry. Indicó que no es experto en LangChain ni LangGraph. Trabajó la prueba por fases (fase 1 y fase 2, con listas de verificación) y generó el código con asistentes de IA. Sostuvo con convicción que los sub-agentes de este caso deben ser deterministas y que el LLM solo debe usarse donde aporta.</w:t>
       </w:r>
     </w:p>
     <w:p>
@@ -1949,7 +1949,7 @@
           <w:sz w:val="20"/>
           <w:szCs w:val="20"/>
         </w:rPr>
-        <w:t xml:space="preserve">Defiende sus decisiones con argumentos (costo, seguridad, determinismo) y reconoció con franqueza que no alcanzó a revisar a detalle el código ni las pruebas. Ante preguntas abiertas de escalabilidad tendió a respuestas generales (“es difícil visualizarlo con este problema”) antes de llegar a propuestas concretas.</w:t>
+        <w:t xml:space="preserve">Defiende sus decisiones con argumentos (costo, seguridad, determinismo) y reconoce con franqueza lo que no domina o no implementó (experiencia en LangGraph, human-in-the-loop, revisión a detalle del código). Ante preguntas abiertas tendió a respuestas generales o que se desviaban del tema, por ejemplo sobre resiliencia, conexión entre agentes o escalabilidad (“es difícil visualizarlo con este problema”).</w:t>
       </w:r>
     </w:p>
     <w:p>
@@ -2291,7 +2291,7 @@
                 <w:sz w:val="19"/>
                 <w:szCs w:val="19"/>
               </w:rPr>
-              <w:t xml:space="preserve">24 / 40</w:t>
+              <w:t xml:space="preserve">22 / 40</w:t>
             </w:r>
           </w:p>
         </w:tc>
@@ -2311,7 +2311,7 @@
                 <w:sz w:val="19"/>
                 <w:szCs w:val="19"/>
               </w:rPr>
-              <w:t xml:space="preserve">6,00</w:t>
+              <w:t xml:space="preserve">5,50</w:t>
             </w:r>
           </w:p>
         </w:tc>
@@ -2362,7 +2362,7 @@
                 <w:sz w:val="19"/>
                 <w:szCs w:val="19"/>
               </w:rPr>
-              <w:t xml:space="preserve">63 / 100</w:t>
+              <w:t xml:space="preserve">61 / 100</w:t>
             </w:r>
           </w:p>
         </w:tc>
@@ -2385,7 +2385,7 @@
                 <w:sz w:val="19"/>
                 <w:szCs w:val="19"/>
               </w:rPr>
-              <w:t xml:space="preserve">6,30</w:t>
+              <w:t xml:space="preserve">6,10</w:t>
             </w:r>
           </w:p>
         </w:tc>
@@ -3506,7 +3506,7 @@
                 <w:sz w:val="19"/>
                 <w:szCs w:val="19"/>
               </w:rPr>
-              <w:t xml:space="preserve">6 / 8</w:t>
+              <w:t xml:space="preserve">5 / 8</w:t>
             </w:r>
           </w:p>
         </w:tc>
@@ -3638,7 +3638,7 @@
                 <w:sz w:val="19"/>
                 <w:szCs w:val="19"/>
               </w:rPr>
-              <w:t xml:space="preserve">5 / 8</w:t>
+              <w:t xml:space="preserve">4 / 8</w:t>
             </w:r>
           </w:p>
         </w:tc>
@@ -3776,7 +3776,7 @@
                 <w:sz w:val="19"/>
                 <w:szCs w:val="19"/>
               </w:rPr>
-              <w:t xml:space="preserve">24 / 40</w:t>
+              <w:t xml:space="preserve">22 / 40</w:t>
             </w:r>
           </w:p>
         </w:tc>
@@ -3931,7 +3931,7 @@
           <w:sz w:val="20"/>
           <w:szCs w:val="20"/>
         </w:rPr>
-        <w:t xml:space="preserve">El flujo completo está cubierto por pruebas de API y de transiciones, con rutas de aprobación, rechazo y revisión manual. No se observó una ejecución contra un LLM real.</w:t>
+        <w:t xml:space="preserve">Ejecutó en vivo el happy path con un token de prueba (aprobado, confianza 0,96 simulada). Las rutas de rechazo y revisión manual están cubiertas por pruebas. Usó el LLM simulado porque el proxy corporativo le impidió conectarse al proveedor real.</w:t>
       </w:r>
     </w:p>
     <w:p>
@@ -4117,7 +4117,7 @@
           <w:sz w:val="20"/>
           <w:szCs w:val="20"/>
         </w:rPr>
-        <w:t xml:space="preserve">Defendió que el flujo de los sub-agentes puede ser determinista y que primero se define bien la arquitectura de puertos y adaptadores. Le costó responder preguntas de escalabilidad sin un escenario concreto.</w:t>
+        <w:t xml:space="preserve">Justificó la API como frontera que no expone el flujo agéntico a internet y explicó con criterio la arquitectura hexagonal: el proveedor de LLM como puerto de salida aislado del dominio, y una versión más simple cuando el problema no amerita tantas interfaces. Reconoció que la solución es un monolito y que, si cae el proceso, caen todos los agentes; no planteó cómo aislar fallos entre ellos.</w:t>
       </w:r>
     </w:p>
     <w:p>
@@ -4133,7 +4133,7 @@
           <w:sz w:val="20"/>
           <w:szCs w:val="20"/>
         </w:rPr>
-        <w:t xml:space="preserve">Decisiones de código e IA (6/8). </w:t>
+        <w:t xml:space="preserve">Decisiones de código e IA (5/8). </w:t>
       </w:r>
       <w:r>
         <w:rPr>
@@ -4141,7 +4141,7 @@
           <w:sz w:val="20"/>
           <w:szCs w:val="20"/>
         </w:rPr>
-        <w:t xml:space="preserve">Muestra criterio en el uso del LLM: identificar qué tareas lo necesitan, cuáles son deterministas y cuáles pueden usar un modelo más barato, con el costo como factor de decisión. Mencionó el motor de Copilot para los agentes, que no aparece en el código.</w:t>
+        <w:t xml:space="preserve">Explicó con claridad que solo el agente de respuesta usa el LLM y que el resto es determinista porque un modelo no da siempre la misma respuesta, y mostró criterio de costo (qué tareas necesitan LLM y cuáles un modelo más barato). Al preguntarle cuándo algo sí sería un agente y cómo conectaría un agente no determinista con el orquestador, respondió de forma general, sin mencionar protocolos de comunicación. Sobre el estado y el contexto no explicó la persistencia que sí existe en su código, y el human-in-the-loop quedó solo como idea.</w:t>
       </w:r>
     </w:p>
     <w:p>
@@ -4181,7 +4181,7 @@
           <w:sz w:val="20"/>
           <w:szCs w:val="20"/>
         </w:rPr>
-        <w:t xml:space="preserve">Seguridad (5/8). </w:t>
+        <w:t xml:space="preserve">Seguridad (4/8). </w:t>
       </w:r>
       <w:r>
         <w:rPr>
@@ -4189,7 +4189,7 @@
           <w:sz w:val="20"/>
           <w:szCs w:val="20"/>
         </w:rPr>
-        <w:t xml:space="preserve">La seguridad implementada es consistente con su diseño (JWT con scopes, mínimo privilegio en herramientas, PII fuera del modelo). En la defensa no profundizó en propagación de identidad ni en control de acceso por dueño del recurso.</w:t>
+        <w:t xml:space="preserve">Trata toda fuente externa como no confiable y por eso incluyó un validador determinista. Describió la autenticación como un JWT generado localmente y la autorización por roles o atributos solo en términos generales, indicando que en su trabajo eso lo resuelve el equipo de seguridad. No explicó en la defensa el mínimo privilegio ni el guard de PII que su código sí implementa.</w:t>
       </w:r>
     </w:p>
     <w:p>
@@ -4241,7 +4241,7 @@
           <w:sz w:val="20"/>
           <w:szCs w:val="20"/>
         </w:rPr>
-        <w:t xml:space="preserve">Se recomienda continuar en el proceso, sujeto a la nota teórica. La solución muestra buen criterio en IA aplicada a un dominio regulado: decisiones fuera del modelo, control de herramientas con mínimo privilegio, PII protegida antes y después del LLM y un respaldo determinista cuando el modelo falla.</w:t>
+        <w:t xml:space="preserve">Se recomienda continuar en el proceso, sujeto a la nota teórica. La solución muestra buen criterio en IA aplicada a un dominio regulado: decisiones fuera del modelo, control de herramientas con mínimo privilegio, PII protegida antes y después del LLM y un respaldo determinista cuando el modelo falla. La defensa explicó el código por debajo de lo que este implementa.</w:t>
       </w:r>
     </w:p>
     <w:p>
@@ -4454,7 +4454,7 @@
                 <w:sz w:val="22"/>
                 <w:szCs w:val="22"/>
               </w:rPr>
-              <w:t xml:space="preserve">17 pruebas de transiciones, permisos, PII y API. Falta probar fallos del proveedor de LLM, concurrencia y acceso a onboardings de otros usuarios. Un solo commit.</w:t>
+              <w:t xml:space="preserve">17 pruebas de transiciones, permisos, PII y API. Falta probar fallos del proveedor de LLM, concurrencia y acceso a onboardings de otros usuarios. Un solo commit; demo con LLM simulado.</w:t>
             </w:r>
           </w:p>
         </w:tc>
@@ -4492,7 +4492,7 @@
                 <w:sz w:val="22"/>
                 <w:szCs w:val="22"/>
               </w:rPr>
-              <w:t xml:space="preserve">Solo Podman Compose local, sin despliegue en la nube ni CI/CD. Sin reintentos ni circuit breaker implementados. Sin trazas ni métricas.</w:t>
+              <w:t xml:space="preserve">Solo Podman Compose local, sin despliegue en la nube ni CI/CD. Monolito: si cae el proceso caen todos los agentes. Sin reintentos, circuit breaker, trazas ni métricas.</w:t>
             </w:r>
           </w:p>
         </w:tc>

</xml_diff>